<commit_message>
git commit -m ""
</commit_message>
<xml_diff>
--- a/public/docs/Rabbit_AI_Report_2025.docx
+++ b/public/docs/Rabbit_AI_Report_2025.docx
@@ -84,8 +84,8 @@
           <w:noProof/>
         </w:rPr>
         <w:drawing>
-          <wp:inline distT="0" distB="0" distL="0" distR="0" wp14:anchorId="433F0676" wp14:editId="6A397A7B">
-            <wp:extent cx="2095500" cy="2643505"/>
+          <wp:inline distT="0" distB="0" distL="0" distR="0" wp14:anchorId="433F0676" wp14:editId="36598EC9">
+            <wp:extent cx="2495550" cy="2643505"/>
             <wp:effectExtent l="0" t="0" r="0" b="4445"/>
             <wp:docPr id="1485546044" name="Picture 2"/>
             <wp:cNvGraphicFramePr>
@@ -116,7 +116,7 @@
                   <pic:spPr bwMode="auto">
                     <a:xfrm>
                       <a:off x="0" y="0"/>
-                      <a:ext cx="2109183" cy="2660766"/>
+                      <a:ext cx="2511846" cy="2660767"/>
                     </a:xfrm>
                     <a:prstGeom prst="rect">
                       <a:avLst/>
@@ -1526,7 +1526,7 @@
           <w:noProof/>
         </w:rPr>
         <w:drawing>
-          <wp:inline distT="0" distB="0" distL="0" distR="0" wp14:anchorId="39C01D6A" wp14:editId="4EC2ADA6">
+          <wp:inline distT="0" distB="0" distL="0" distR="0" wp14:anchorId="39C01D6A" wp14:editId="6C31320A">
             <wp:extent cx="5943600" cy="3964305"/>
             <wp:effectExtent l="0" t="0" r="0" b="0"/>
             <wp:docPr id="637956809" name="Picture 18"/>
@@ -4321,6 +4321,7 @@
   <w:style w:type="character" w:default="1" w:styleId="DefaultParagraphFont">
     <w:name w:val="Default Paragraph Font"/>
     <w:uiPriority w:val="1"/>
+    <w:semiHidden/>
     <w:unhideWhenUsed/>
   </w:style>
   <w:style w:type="table" w:default="1" w:styleId="TableNormal">

</xml_diff>